<commit_message>
Add HTTP-over-SLIM mesh leg (cell 4) with round-trip comparison and refreshed report
</commit_message>
<xml_diff>
--- a/docs/SLIM_FULL_MESH_CONCURRENCY_REPORT.docx
+++ b/docs/SLIM_FULL_MESH_CONCURRENCY_REPORT.docx
@@ -592,7 +592,7 @@
                 <w:sz w:val="19"/>
                 <w:szCs w:val="19"/>
               </w:rPr>
-              <w:t xml:space="preserve">Pending</w:t>
+              <w:t xml:space="preserve">Done</w:t>
             </w:r>
           </w:p>
         </w:tc>
@@ -619,7 +619,7 @@
           <w:sz w:val="22"/>
           <w:szCs w:val="22"/>
         </w:rPr>
-        <w:t xml:space="preserve">This iteration delivers cell 3 in full and the measurement method that all cells will use. Cells 1, 2, and 4 depend on the A2A application layer and the A2A-over-SLIM tunnel, which are owned jointly with the semantic-negotiation work and are not yet wired in.</w:t>
+        <w:t xml:space="preserve">This iteration delivers both HTTP cells (3 and 4) and the measurement method that all cells use. Cells 1 and 2 depend on the A2A application layer and the A2A-over-SLIM tunnel, which are owned jointly with the semantic-negotiation work and are not yet wired in.</w:t>
       </w:r>
     </w:p>
     <w:p>
@@ -715,7 +715,7 @@
           <w:sz w:val="22"/>
           <w:szCs w:val="22"/>
         </w:rPr>
-        <w:t xml:space="preserve">Each agent is a real participant: for SLIM it is a slim-bindings application that subscribes its own name and holds a point-to-point session to every peer; for HTTP it is a small HTTP server with a keep-alive connection to every peer. Sessions and connections are opened once in a warm phase, so the per-message timer measures the send path, not setup.</w:t>
+        <w:t xml:space="preserve">Each agent is a real participant: for HTTP without SLIM it is a small HTTP server with a keep-alive connection to every peer; for the SLIM mesh it is a slim-bindings application that subscribes its own name and holds a point-to-point session to every peer; for HTTP over SLIM each agent tunnels an HTTP-style request and response through a SLIM point-to-point session, with the peer replying on the same session. Sessions and connections are opened once in a warm phase, so the per-message timer measures the send path, not setup.</w:t>
       </w:r>
     </w:p>
     <w:p>
@@ -2925,6 +2925,577 @@
     </w:tbl>
     <w:p>
       <w:pPr>
+        <w:pStyle w:val="Heading2"/>
+      </w:pPr>
+      <w:r>
+        <w:t xml:space="preserve">6.4 HTTP with and without SLIM (round trip)</w:t>
+      </w:r>
+    </w:p>
+    <w:p>
+      <w:pPr>
+        <w:spacing w:after="120"/>
+      </w:pPr>
+      <w:r>
+        <w:rPr>
+          <w:sz w:val="22"/>
+          <w:szCs w:val="22"/>
+        </w:rPr>
+        <w:t xml:space="preserve">Both legs measure a full request-response round trip, so they are directly comparable. Sequential, 64-byte payload, 3 rounds.</w:t>
+      </w:r>
+    </w:p>
+    <w:tbl>
+      <w:tblPr>
+        <w:tblW w:type="dxa" w:w="9360"/>
+        <w:tblBorders>
+          <w:top w:val="single" w:color="auto" w:sz="4"/>
+          <w:left w:val="single" w:color="auto" w:sz="4"/>
+          <w:bottom w:val="single" w:color="auto" w:sz="4"/>
+          <w:right w:val="single" w:color="auto" w:sz="4"/>
+          <w:insideH w:val="single" w:color="auto" w:sz="4"/>
+          <w:insideV w:val="single" w:color="auto" w:sz="4"/>
+        </w:tblBorders>
+      </w:tblPr>
+      <w:tblGrid>
+        <w:gridCol w:w="1500"/>
+        <w:gridCol w:w="2400"/>
+        <w:gridCol w:w="2400"/>
+        <w:gridCol w:w="3060"/>
+      </w:tblGrid>
+      <w:tr>
+        <w:trPr>
+          <w:tblHeader/>
+        </w:trPr>
+        <w:tc>
+          <w:tcPr>
+            <w:tcW w:type="dxa" w:w="1500"/>
+            <w:tcBorders>
+              <w:top w:val="single" w:color="BBBBBB" w:sz="1"/>
+              <w:left w:val="single" w:color="BBBBBB" w:sz="1"/>
+              <w:bottom w:val="single" w:color="BBBBBB" w:sz="1"/>
+              <w:right w:val="single" w:color="BBBBBB" w:sz="1"/>
+            </w:tcBorders>
+            <w:shd w:fill="D9E2EC" w:val="clear"/>
+            <w:tcMar>
+              <w:top w:type="dxa" w:w="60"/>
+              <w:left w:type="dxa" w:w="110"/>
+              <w:bottom w:type="dxa" w:w="60"/>
+              <w:right w:type="dxa" w:w="110"/>
+            </w:tcMar>
+          </w:tcPr>
+          <w:p>
+            <w:pPr>
+              <w:jc w:val="left"/>
+            </w:pPr>
+            <w:r>
+              <w:rPr>
+                <w:b/>
+                <w:bCs/>
+                <w:sz w:val="19"/>
+                <w:szCs w:val="19"/>
+              </w:rPr>
+              <w:t xml:space="preserve">Agents</w:t>
+            </w:r>
+          </w:p>
+        </w:tc>
+        <w:tc>
+          <w:tcPr>
+            <w:tcW w:type="dxa" w:w="2400"/>
+            <w:tcBorders>
+              <w:top w:val="single" w:color="BBBBBB" w:sz="1"/>
+              <w:left w:val="single" w:color="BBBBBB" w:sz="1"/>
+              <w:bottom w:val="single" w:color="BBBBBB" w:sz="1"/>
+              <w:right w:val="single" w:color="BBBBBB" w:sz="1"/>
+            </w:tcBorders>
+            <w:shd w:fill="D9E2EC" w:val="clear"/>
+            <w:tcMar>
+              <w:top w:type="dxa" w:w="60"/>
+              <w:left w:type="dxa" w:w="110"/>
+              <w:bottom w:type="dxa" w:w="60"/>
+              <w:right w:type="dxa" w:w="110"/>
+            </w:tcMar>
+          </w:tcPr>
+          <w:p>
+            <w:pPr>
+              <w:jc w:val="right"/>
+            </w:pPr>
+            <w:r>
+              <w:rPr>
+                <w:b/>
+                <w:bCs/>
+                <w:sz w:val="19"/>
+                <w:szCs w:val="19"/>
+              </w:rPr>
+              <w:t xml:space="preserve">HTTP no SLIM mean</w:t>
+            </w:r>
+          </w:p>
+        </w:tc>
+        <w:tc>
+          <w:tcPr>
+            <w:tcW w:type="dxa" w:w="2400"/>
+            <w:tcBorders>
+              <w:top w:val="single" w:color="BBBBBB" w:sz="1"/>
+              <w:left w:val="single" w:color="BBBBBB" w:sz="1"/>
+              <w:bottom w:val="single" w:color="BBBBBB" w:sz="1"/>
+              <w:right w:val="single" w:color="BBBBBB" w:sz="1"/>
+            </w:tcBorders>
+            <w:shd w:fill="D9E2EC" w:val="clear"/>
+            <w:tcMar>
+              <w:top w:type="dxa" w:w="60"/>
+              <w:left w:type="dxa" w:w="110"/>
+              <w:bottom w:type="dxa" w:w="60"/>
+              <w:right w:type="dxa" w:w="110"/>
+            </w:tcMar>
+          </w:tcPr>
+          <w:p>
+            <w:pPr>
+              <w:jc w:val="right"/>
+            </w:pPr>
+            <w:r>
+              <w:rPr>
+                <w:b/>
+                <w:bCs/>
+                <w:sz w:val="19"/>
+                <w:szCs w:val="19"/>
+              </w:rPr>
+              <w:t xml:space="preserve">HTTP over SLIM mean</w:t>
+            </w:r>
+          </w:p>
+        </w:tc>
+        <w:tc>
+          <w:tcPr>
+            <w:tcW w:type="dxa" w:w="3060"/>
+            <w:tcBorders>
+              <w:top w:val="single" w:color="BBBBBB" w:sz="1"/>
+              <w:left w:val="single" w:color="BBBBBB" w:sz="1"/>
+              <w:bottom w:val="single" w:color="BBBBBB" w:sz="1"/>
+              <w:right w:val="single" w:color="BBBBBB" w:sz="1"/>
+            </w:tcBorders>
+            <w:shd w:fill="D9E2EC" w:val="clear"/>
+            <w:tcMar>
+              <w:top w:type="dxa" w:w="60"/>
+              <w:left w:type="dxa" w:w="110"/>
+              <w:bottom w:type="dxa" w:w="60"/>
+              <w:right w:type="dxa" w:w="110"/>
+            </w:tcMar>
+          </w:tcPr>
+          <w:p>
+            <w:pPr>
+              <w:jc w:val="right"/>
+            </w:pPr>
+            <w:r>
+              <w:rPr>
+                <w:b/>
+                <w:bCs/>
+                <w:sz w:val="19"/>
+                <w:szCs w:val="19"/>
+              </w:rPr>
+              <w:t xml:space="preserve">Improvement</w:t>
+            </w:r>
+          </w:p>
+        </w:tc>
+      </w:tr>
+      <w:tr>
+        <w:trPr>
+          <w:tblHeader w:val="false"/>
+        </w:trPr>
+        <w:tc>
+          <w:tcPr>
+            <w:tcW w:type="dxa" w:w="1500"/>
+            <w:tcBorders>
+              <w:top w:val="single" w:color="BBBBBB" w:sz="1"/>
+              <w:left w:val="single" w:color="BBBBBB" w:sz="1"/>
+              <w:bottom w:val="single" w:color="BBBBBB" w:sz="1"/>
+              <w:right w:val="single" w:color="BBBBBB" w:sz="1"/>
+            </w:tcBorders>
+            <w:shd w:fill="FFFFFF" w:val="clear"/>
+            <w:tcMar>
+              <w:top w:type="dxa" w:w="60"/>
+              <w:left w:type="dxa" w:w="110"/>
+              <w:bottom w:type="dxa" w:w="60"/>
+              <w:right w:type="dxa" w:w="110"/>
+            </w:tcMar>
+          </w:tcPr>
+          <w:p>
+            <w:pPr>
+              <w:jc w:val="left"/>
+            </w:pPr>
+            <w:r>
+              <w:rPr>
+                <w:b w:val="false"/>
+                <w:bCs w:val="false"/>
+                <w:sz w:val="19"/>
+                <w:szCs w:val="19"/>
+              </w:rPr>
+              <w:t xml:space="preserve">5</w:t>
+            </w:r>
+          </w:p>
+        </w:tc>
+        <w:tc>
+          <w:tcPr>
+            <w:tcW w:type="dxa" w:w="2400"/>
+            <w:tcBorders>
+              <w:top w:val="single" w:color="BBBBBB" w:sz="1"/>
+              <w:left w:val="single" w:color="BBBBBB" w:sz="1"/>
+              <w:bottom w:val="single" w:color="BBBBBB" w:sz="1"/>
+              <w:right w:val="single" w:color="BBBBBB" w:sz="1"/>
+            </w:tcBorders>
+            <w:shd w:fill="FFFFFF" w:val="clear"/>
+            <w:tcMar>
+              <w:top w:type="dxa" w:w="60"/>
+              <w:left w:type="dxa" w:w="110"/>
+              <w:bottom w:type="dxa" w:w="60"/>
+              <w:right w:type="dxa" w:w="110"/>
+            </w:tcMar>
+          </w:tcPr>
+          <w:p>
+            <w:pPr>
+              <w:jc w:val="right"/>
+            </w:pPr>
+            <w:r>
+              <w:rPr>
+                <w:b w:val="false"/>
+                <w:bCs w:val="false"/>
+                <w:sz w:val="19"/>
+                <w:szCs w:val="19"/>
+              </w:rPr>
+              <w:t xml:space="preserve">0.431</w:t>
+            </w:r>
+          </w:p>
+        </w:tc>
+        <w:tc>
+          <w:tcPr>
+            <w:tcW w:type="dxa" w:w="2400"/>
+            <w:tcBorders>
+              <w:top w:val="single" w:color="BBBBBB" w:sz="1"/>
+              <w:left w:val="single" w:color="BBBBBB" w:sz="1"/>
+              <w:bottom w:val="single" w:color="BBBBBB" w:sz="1"/>
+              <w:right w:val="single" w:color="BBBBBB" w:sz="1"/>
+            </w:tcBorders>
+            <w:shd w:fill="FFFFFF" w:val="clear"/>
+            <w:tcMar>
+              <w:top w:type="dxa" w:w="60"/>
+              <w:left w:type="dxa" w:w="110"/>
+              <w:bottom w:type="dxa" w:w="60"/>
+              <w:right w:type="dxa" w:w="110"/>
+            </w:tcMar>
+          </w:tcPr>
+          <w:p>
+            <w:pPr>
+              <w:jc w:val="right"/>
+            </w:pPr>
+            <w:r>
+              <w:rPr>
+                <w:b w:val="false"/>
+                <w:bCs w:val="false"/>
+                <w:sz w:val="19"/>
+                <w:szCs w:val="19"/>
+              </w:rPr>
+              <w:t xml:space="preserve">0.221</w:t>
+            </w:r>
+          </w:p>
+        </w:tc>
+        <w:tc>
+          <w:tcPr>
+            <w:tcW w:type="dxa" w:w="3060"/>
+            <w:tcBorders>
+              <w:top w:val="single" w:color="BBBBBB" w:sz="1"/>
+              <w:left w:val="single" w:color="BBBBBB" w:sz="1"/>
+              <w:bottom w:val="single" w:color="BBBBBB" w:sz="1"/>
+              <w:right w:val="single" w:color="BBBBBB" w:sz="1"/>
+            </w:tcBorders>
+            <w:shd w:fill="FFFFFF" w:val="clear"/>
+            <w:tcMar>
+              <w:top w:type="dxa" w:w="60"/>
+              <w:left w:type="dxa" w:w="110"/>
+              <w:bottom w:type="dxa" w:w="60"/>
+              <w:right w:type="dxa" w:w="110"/>
+            </w:tcMar>
+          </w:tcPr>
+          <w:p>
+            <w:pPr>
+              <w:jc w:val="right"/>
+            </w:pPr>
+            <w:r>
+              <w:rPr>
+                <w:b w:val="false"/>
+                <w:bCs w:val="false"/>
+                <w:sz w:val="19"/>
+                <w:szCs w:val="19"/>
+              </w:rPr>
+              <w:t xml:space="preserve">49 %</w:t>
+            </w:r>
+          </w:p>
+        </w:tc>
+      </w:tr>
+      <w:tr>
+        <w:trPr>
+          <w:tblHeader w:val="false"/>
+        </w:trPr>
+        <w:tc>
+          <w:tcPr>
+            <w:tcW w:type="dxa" w:w="1500"/>
+            <w:tcBorders>
+              <w:top w:val="single" w:color="BBBBBB" w:sz="1"/>
+              <w:left w:val="single" w:color="BBBBBB" w:sz="1"/>
+              <w:bottom w:val="single" w:color="BBBBBB" w:sz="1"/>
+              <w:right w:val="single" w:color="BBBBBB" w:sz="1"/>
+            </w:tcBorders>
+            <w:shd w:fill="F2F5F8" w:val="clear"/>
+            <w:tcMar>
+              <w:top w:type="dxa" w:w="60"/>
+              <w:left w:type="dxa" w:w="110"/>
+              <w:bottom w:type="dxa" w:w="60"/>
+              <w:right w:type="dxa" w:w="110"/>
+            </w:tcMar>
+          </w:tcPr>
+          <w:p>
+            <w:pPr>
+              <w:jc w:val="left"/>
+            </w:pPr>
+            <w:r>
+              <w:rPr>
+                <w:b w:val="false"/>
+                <w:bCs w:val="false"/>
+                <w:sz w:val="19"/>
+                <w:szCs w:val="19"/>
+              </w:rPr>
+              <w:t xml:space="preserve">10</w:t>
+            </w:r>
+          </w:p>
+        </w:tc>
+        <w:tc>
+          <w:tcPr>
+            <w:tcW w:type="dxa" w:w="2400"/>
+            <w:tcBorders>
+              <w:top w:val="single" w:color="BBBBBB" w:sz="1"/>
+              <w:left w:val="single" w:color="BBBBBB" w:sz="1"/>
+              <w:bottom w:val="single" w:color="BBBBBB" w:sz="1"/>
+              <w:right w:val="single" w:color="BBBBBB" w:sz="1"/>
+            </w:tcBorders>
+            <w:shd w:fill="F2F5F8" w:val="clear"/>
+            <w:tcMar>
+              <w:top w:type="dxa" w:w="60"/>
+              <w:left w:type="dxa" w:w="110"/>
+              <w:bottom w:type="dxa" w:w="60"/>
+              <w:right w:type="dxa" w:w="110"/>
+            </w:tcMar>
+          </w:tcPr>
+          <w:p>
+            <w:pPr>
+              <w:jc w:val="right"/>
+            </w:pPr>
+            <w:r>
+              <w:rPr>
+                <w:b w:val="false"/>
+                <w:bCs w:val="false"/>
+                <w:sz w:val="19"/>
+                <w:szCs w:val="19"/>
+              </w:rPr>
+              <w:t xml:space="preserve">0.220</w:t>
+            </w:r>
+          </w:p>
+        </w:tc>
+        <w:tc>
+          <w:tcPr>
+            <w:tcW w:type="dxa" w:w="2400"/>
+            <w:tcBorders>
+              <w:top w:val="single" w:color="BBBBBB" w:sz="1"/>
+              <w:left w:val="single" w:color="BBBBBB" w:sz="1"/>
+              <w:bottom w:val="single" w:color="BBBBBB" w:sz="1"/>
+              <w:right w:val="single" w:color="BBBBBB" w:sz="1"/>
+            </w:tcBorders>
+            <w:shd w:fill="F2F5F8" w:val="clear"/>
+            <w:tcMar>
+              <w:top w:type="dxa" w:w="60"/>
+              <w:left w:type="dxa" w:w="110"/>
+              <w:bottom w:type="dxa" w:w="60"/>
+              <w:right w:type="dxa" w:w="110"/>
+            </w:tcMar>
+          </w:tcPr>
+          <w:p>
+            <w:pPr>
+              <w:jc w:val="right"/>
+            </w:pPr>
+            <w:r>
+              <w:rPr>
+                <w:b w:val="false"/>
+                <w:bCs w:val="false"/>
+                <w:sz w:val="19"/>
+                <w:szCs w:val="19"/>
+              </w:rPr>
+              <w:t xml:space="preserve">0.160</w:t>
+            </w:r>
+          </w:p>
+        </w:tc>
+        <w:tc>
+          <w:tcPr>
+            <w:tcW w:type="dxa" w:w="3060"/>
+            <w:tcBorders>
+              <w:top w:val="single" w:color="BBBBBB" w:sz="1"/>
+              <w:left w:val="single" w:color="BBBBBB" w:sz="1"/>
+              <w:bottom w:val="single" w:color="BBBBBB" w:sz="1"/>
+              <w:right w:val="single" w:color="BBBBBB" w:sz="1"/>
+            </w:tcBorders>
+            <w:shd w:fill="F2F5F8" w:val="clear"/>
+            <w:tcMar>
+              <w:top w:type="dxa" w:w="60"/>
+              <w:left w:type="dxa" w:w="110"/>
+              <w:bottom w:type="dxa" w:w="60"/>
+              <w:right w:type="dxa" w:w="110"/>
+            </w:tcMar>
+          </w:tcPr>
+          <w:p>
+            <w:pPr>
+              <w:jc w:val="right"/>
+            </w:pPr>
+            <w:r>
+              <w:rPr>
+                <w:b w:val="false"/>
+                <w:bCs w:val="false"/>
+                <w:sz w:val="19"/>
+                <w:szCs w:val="19"/>
+              </w:rPr>
+              <w:t xml:space="preserve">27 %</w:t>
+            </w:r>
+          </w:p>
+        </w:tc>
+      </w:tr>
+      <w:tr>
+        <w:trPr>
+          <w:tblHeader w:val="false"/>
+        </w:trPr>
+        <w:tc>
+          <w:tcPr>
+            <w:tcW w:type="dxa" w:w="1500"/>
+            <w:tcBorders>
+              <w:top w:val="single" w:color="BBBBBB" w:sz="1"/>
+              <w:left w:val="single" w:color="BBBBBB" w:sz="1"/>
+              <w:bottom w:val="single" w:color="BBBBBB" w:sz="1"/>
+              <w:right w:val="single" w:color="BBBBBB" w:sz="1"/>
+            </w:tcBorders>
+            <w:shd w:fill="FFFFFF" w:val="clear"/>
+            <w:tcMar>
+              <w:top w:type="dxa" w:w="60"/>
+              <w:left w:type="dxa" w:w="110"/>
+              <w:bottom w:type="dxa" w:w="60"/>
+              <w:right w:type="dxa" w:w="110"/>
+            </w:tcMar>
+          </w:tcPr>
+          <w:p>
+            <w:pPr>
+              <w:jc w:val="left"/>
+            </w:pPr>
+            <w:r>
+              <w:rPr>
+                <w:b w:val="false"/>
+                <w:bCs w:val="false"/>
+                <w:sz w:val="19"/>
+                <w:szCs w:val="19"/>
+              </w:rPr>
+              <w:t xml:space="preserve">20</w:t>
+            </w:r>
+          </w:p>
+        </w:tc>
+        <w:tc>
+          <w:tcPr>
+            <w:tcW w:type="dxa" w:w="2400"/>
+            <w:tcBorders>
+              <w:top w:val="single" w:color="BBBBBB" w:sz="1"/>
+              <w:left w:val="single" w:color="BBBBBB" w:sz="1"/>
+              <w:bottom w:val="single" w:color="BBBBBB" w:sz="1"/>
+              <w:right w:val="single" w:color="BBBBBB" w:sz="1"/>
+            </w:tcBorders>
+            <w:shd w:fill="FFFFFF" w:val="clear"/>
+            <w:tcMar>
+              <w:top w:type="dxa" w:w="60"/>
+              <w:left w:type="dxa" w:w="110"/>
+              <w:bottom w:type="dxa" w:w="60"/>
+              <w:right w:type="dxa" w:w="110"/>
+            </w:tcMar>
+          </w:tcPr>
+          <w:p>
+            <w:pPr>
+              <w:jc w:val="right"/>
+            </w:pPr>
+            <w:r>
+              <w:rPr>
+                <w:b w:val="false"/>
+                <w:bCs w:val="false"/>
+                <w:sz w:val="19"/>
+                <w:szCs w:val="19"/>
+              </w:rPr>
+              <w:t xml:space="preserve">0.229</w:t>
+            </w:r>
+          </w:p>
+        </w:tc>
+        <w:tc>
+          <w:tcPr>
+            <w:tcW w:type="dxa" w:w="2400"/>
+            <w:tcBorders>
+              <w:top w:val="single" w:color="BBBBBB" w:sz="1"/>
+              <w:left w:val="single" w:color="BBBBBB" w:sz="1"/>
+              <w:bottom w:val="single" w:color="BBBBBB" w:sz="1"/>
+              <w:right w:val="single" w:color="BBBBBB" w:sz="1"/>
+            </w:tcBorders>
+            <w:shd w:fill="FFFFFF" w:val="clear"/>
+            <w:tcMar>
+              <w:top w:type="dxa" w:w="60"/>
+              <w:left w:type="dxa" w:w="110"/>
+              <w:bottom w:type="dxa" w:w="60"/>
+              <w:right w:type="dxa" w:w="110"/>
+            </w:tcMar>
+          </w:tcPr>
+          <w:p>
+            <w:pPr>
+              <w:jc w:val="right"/>
+            </w:pPr>
+            <w:r>
+              <w:rPr>
+                <w:b w:val="false"/>
+                <w:bCs w:val="false"/>
+                <w:sz w:val="19"/>
+                <w:szCs w:val="19"/>
+              </w:rPr>
+              <w:t xml:space="preserve">0.155</w:t>
+            </w:r>
+          </w:p>
+        </w:tc>
+        <w:tc>
+          <w:tcPr>
+            <w:tcW w:type="dxa" w:w="3060"/>
+            <w:tcBorders>
+              <w:top w:val="single" w:color="BBBBBB" w:sz="1"/>
+              <w:left w:val="single" w:color="BBBBBB" w:sz="1"/>
+              <w:bottom w:val="single" w:color="BBBBBB" w:sz="1"/>
+              <w:right w:val="single" w:color="BBBBBB" w:sz="1"/>
+            </w:tcBorders>
+            <w:shd w:fill="FFFFFF" w:val="clear"/>
+            <w:tcMar>
+              <w:top w:type="dxa" w:w="60"/>
+              <w:left w:type="dxa" w:w="110"/>
+              <w:bottom w:type="dxa" w:w="60"/>
+              <w:right w:type="dxa" w:w="110"/>
+            </w:tcMar>
+          </w:tcPr>
+          <w:p>
+            <w:pPr>
+              <w:jc w:val="right"/>
+            </w:pPr>
+            <w:r>
+              <w:rPr>
+                <w:b w:val="false"/>
+                <w:bCs w:val="false"/>
+                <w:sz w:val="19"/>
+                <w:szCs w:val="19"/>
+              </w:rPr>
+              <w:t xml:space="preserve">32 %</w:t>
+            </w:r>
+          </w:p>
+        </w:tc>
+      </w:tr>
+    </w:tbl>
+    <w:p>
+      <w:pPr>
         <w:pStyle w:val="Heading1"/>
       </w:pPr>
       <w:r>
@@ -3001,6 +3572,23 @@
     </w:p>
     <w:p>
       <w:pPr>
+        <w:pStyle w:val="ListParagraph"/>
+        <w:numPr>
+          <w:ilvl w:val="0"/>
+          <w:numId w:val="2"/>
+        </w:numPr>
+        <w:spacing w:after="60"/>
+      </w:pPr>
+      <w:r>
+        <w:rPr>
+          <w:sz w:val="22"/>
+          <w:szCs w:val="22"/>
+        </w:rPr>
+        <w:t xml:space="preserve">On a like-for-like round trip, HTTP over SLIM is faster than direct HTTP, by about 32 percent at 20 agents, which is consistent with the previously reported improvement near 33 percent.</w:t>
+      </w:r>
+    </w:p>
+    <w:p>
+      <w:pPr>
         <w:pStyle w:val="Heading1"/>
       </w:pPr>
       <w:r>
@@ -3210,6 +3798,65 @@
           <w:sz w:val="22"/>
           <w:szCs w:val="22"/>
         </w:rPr>
+        <w:t xml:space="preserve">Run the HTTP-over-SLIM sweep (cell 4; needs the node).</w:t>
+      </w:r>
+    </w:p>
+    <w:p>
+      <w:pPr>
+        <w:shd w:fill="F0F0F0" w:val="clear"/>
+        <w:spacing w:after="40"/>
+      </w:pPr>
+      <w:r>
+        <w:rPr>
+          <w:rFonts w:ascii="Consolas" w:cs="Consolas" w:eastAsia="Consolas" w:hAnsi="Consolas"/>
+          <w:sz w:val="18"/>
+          <w:szCs w:val="18"/>
+        </w:rPr>
+        <w:t xml:space="preserve">PYTHONPATH=. .venv-mesh/bin/python http_slim_mesh_benchmark.py --sweep \</w:t>
+      </w:r>
+    </w:p>
+    <w:p>
+      <w:pPr>
+        <w:shd w:fill="F0F0F0" w:val="clear"/>
+        <w:spacing w:after="40"/>
+      </w:pPr>
+      <w:r>
+        <w:rPr>
+          <w:rFonts w:ascii="Consolas" w:cs="Consolas" w:eastAsia="Consolas" w:hAnsi="Consolas"/>
+          <w:sz w:val="18"/>
+          <w:szCs w:val="18"/>
+        </w:rPr>
+        <w:t xml:space="preserve">  --agents-list 5,10,20 --payloads 64,512 --rounds 3 \</w:t>
+      </w:r>
+    </w:p>
+    <w:p>
+      <w:pPr>
+        <w:shd w:fill="F0F0F0" w:val="clear"/>
+        <w:spacing w:after="40"/>
+      </w:pPr>
+      <w:r>
+        <w:rPr>
+          <w:rFonts w:ascii="Consolas" w:cs="Consolas" w:eastAsia="Consolas" w:hAnsi="Consolas"/>
+          <w:sz w:val="18"/>
+          <w:szCs w:val="18"/>
+        </w:rPr>
+        <w:t xml:space="preserve">  --output docs/evidence/http_slim_mesh_sweep.json</w:t>
+      </w:r>
+    </w:p>
+    <w:p>
+      <w:pPr>
+        <w:pStyle w:val="ListParagraph"/>
+        <w:numPr>
+          <w:ilvl w:val="0"/>
+          <w:numId w:val="3"/>
+        </w:numPr>
+        <w:spacing w:after="60"/>
+      </w:pPr>
+      <w:r>
+        <w:rPr>
+          <w:sz w:val="22"/>
+          <w:szCs w:val="22"/>
+        </w:rPr>
         <w:t xml:space="preserve">Stop the node when finished.</w:t>
       </w:r>
     </w:p>
@@ -3317,7 +3964,7 @@
           <w:sz w:val="22"/>
           <w:szCs w:val="22"/>
         </w:rPr>
-        <w:t xml:space="preserve">slim_bench/results.py: shared result and summary-statistics shape used by every leg.</w:t>
+        <w:t xml:space="preserve">slim_bench/http_slim_mesh.py and http_slim_mesh_benchmark.py: HTTP-over-SLIM harness and runner (cell 4).</w:t>
       </w:r>
     </w:p>
     <w:p>
@@ -3334,15 +3981,7 @@
           <w:sz w:val="22"/>
           <w:szCs w:val="22"/>
         </w:rPr>
-        <w:t xml:space="preserve">docs/evidence/mesh_sweep_parallel.json and http_mesh_sweep_parallel.json: raw results behind this report.</w:t>
-      </w:r>
-    </w:p>
-    <w:p>
-      <w:pPr>
-        <w:pStyle w:val="Heading1"/>
-      </w:pPr>
-      <w:r>
-        <w:t xml:space="preserve">10. Limitations and open items</w:t>
+        <w:t xml:space="preserve">slim_bench/results.py: shared result and summary-statistics shape used by every leg.</w:t>
       </w:r>
     </w:p>
     <w:p>
@@ -3359,7 +3998,15 @@
           <w:sz w:val="22"/>
           <w:szCs w:val="22"/>
         </w:rPr>
-        <w:t xml:space="preserve">All measurements are loopback on one machine, so they are a lower bound; numbers will move over a real network.</w:t>
+        <w:t xml:space="preserve">docs/evidence: mesh_sweep_parallel.json, http_mesh_sweep_parallel.json, and http_slim_mesh_sweep.json hold the raw results behind this report.</w:t>
+      </w:r>
+    </w:p>
+    <w:p>
+      <w:pPr>
+        <w:pStyle w:val="Heading1"/>
+      </w:pPr>
+      <w:r>
+        <w:t xml:space="preserve">10. Limitations and open items</w:t>
       </w:r>
     </w:p>
     <w:p>
@@ -3376,7 +4023,7 @@
           <w:sz w:val="22"/>
           <w:szCs w:val="22"/>
         </w:rPr>
-        <w:t xml:space="preserve">True simultaneity is capped at the core count (12 here); larger agent counts are partly time-sliced.</w:t>
+        <w:t xml:space="preserve">All measurements are loopback on one machine, so they are a lower bound; numbers will move over a real network.</w:t>
       </w:r>
     </w:p>
     <w:p>
@@ -3393,7 +4040,7 @@
           <w:sz w:val="22"/>
           <w:szCs w:val="22"/>
         </w:rPr>
-        <w:t xml:space="preserve">Message model is not yet pinned: SLIM measures a one-way publish to confirmed delivery, while HTTP measures a full request-response round trip. These are not yet symmetric and must be aligned before the headline comparison.</w:t>
+        <w:t xml:space="preserve">True simultaneity is capped at the core count (12 here); larger agent counts are partly time-sliced.</w:t>
       </w:r>
     </w:p>
     <w:p>
@@ -3410,7 +4057,41 @@
           <w:sz w:val="22"/>
           <w:szCs w:val="22"/>
         </w:rPr>
-        <w:t xml:space="preserve">Cells 1, 2, and 4 (A2A and the A2A-over-SLIM tunnel) remain to be built; the sweep should then be extended toward 100 agents.</w:t>
+        <w:t xml:space="preserve">Message model is not yet pinned: SLIM measures a one-way publish to confirmed delivery, while HTTP measures a full request-response round trip. These are not yet symmetric and must be aligned before the headline comparison.</w:t>
+      </w:r>
+    </w:p>
+    <w:p>
+      <w:pPr>
+        <w:pStyle w:val="ListParagraph"/>
+        <w:numPr>
+          <w:ilvl w:val="0"/>
+          <w:numId w:val="2"/>
+        </w:numPr>
+        <w:spacing w:after="60"/>
+      </w:pPr>
+      <w:r>
+        <w:rPr>
+          <w:sz w:val="22"/>
+          <w:szCs w:val="22"/>
+        </w:rPr>
+        <w:t xml:space="preserve">Cells 1 and 2 (A2A and the A2A-over-SLIM tunnel) remain to be built; the sweep should then be extended toward 100 agents.</w:t>
+      </w:r>
+    </w:p>
+    <w:p>
+      <w:pPr>
+        <w:pStyle w:val="ListParagraph"/>
+        <w:numPr>
+          <w:ilvl w:val="0"/>
+          <w:numId w:val="2"/>
+        </w:numPr>
+        <w:spacing w:after="60"/>
+      </w:pPr>
+      <w:r>
+        <w:rPr>
+          <w:sz w:val="22"/>
+          <w:szCs w:val="22"/>
+        </w:rPr>
+        <w:t xml:space="preserve">Cell 4 currently has sequential and concurrent modes; the process-per-agent parallel mode can be added for full symmetry with the other legs.</w:t>
       </w:r>
     </w:p>
     <w:sectPr>

</xml_diff>

<commit_message>
Refresh report with all four cells done and A2A with-vs-without-SLIM comparison
</commit_message>
<xml_diff>
--- a/docs/SLIM_FULL_MESH_CONCURRENCY_REPORT.docx
+++ b/docs/SLIM_FULL_MESH_CONCURRENCY_REPORT.docx
@@ -289,7 +289,7 @@
                 <w:sz w:val="19"/>
                 <w:szCs w:val="19"/>
               </w:rPr>
-              <w:t xml:space="preserve">Pending</w:t>
+              <w:t xml:space="preserve">Done</w:t>
             </w:r>
           </w:p>
         </w:tc>
@@ -390,7 +390,7 @@
                 <w:sz w:val="19"/>
                 <w:szCs w:val="19"/>
               </w:rPr>
-              <w:t xml:space="preserve">Pending</w:t>
+              <w:t xml:space="preserve">Done</w:t>
             </w:r>
           </w:p>
         </w:tc>
@@ -619,7 +619,7 @@
           <w:sz w:val="22"/>
           <w:szCs w:val="22"/>
         </w:rPr>
-        <w:t xml:space="preserve">This iteration delivers both HTTP cells (3 and 4) and the measurement method that all cells use. Cells 1 and 2 depend on the A2A application layer and the A2A-over-SLIM tunnel, which are owned jointly with the semantic-negotiation work and are not yet wired in.</w:t>
+        <w:t xml:space="preserve">All four cells are now implemented and measured. Cells 1 and 2 use the A2A client and server from the agentic-itsm develop branch with a trivial echo agent, so they measure pure transport rather than semantic negotiation.</w:t>
       </w:r>
     </w:p>
     <w:p>
@@ -3496,6 +3496,577 @@
     </w:tbl>
     <w:p>
       <w:pPr>
+        <w:pStyle w:val="Heading2"/>
+      </w:pPr>
+      <w:r>
+        <w:t xml:space="preserve">6.5 A2A with and without SLIM (round trip)</w:t>
+      </w:r>
+    </w:p>
+    <w:p>
+      <w:pPr>
+        <w:spacing w:after="120"/>
+      </w:pPr>
+      <w:r>
+        <w:rPr>
+          <w:sz w:val="22"/>
+          <w:szCs w:val="22"/>
+        </w:rPr>
+        <w:t xml:space="preserve">A2A over an echo agent, process per agent, sequential fan-out, 64-byte payload, 3 rounds. Each unit is one A2A request to its result artifact.</w:t>
+      </w:r>
+    </w:p>
+    <w:tbl>
+      <w:tblPr>
+        <w:tblW w:type="dxa" w:w="9360"/>
+        <w:tblBorders>
+          <w:top w:val="single" w:color="auto" w:sz="4"/>
+          <w:left w:val="single" w:color="auto" w:sz="4"/>
+          <w:bottom w:val="single" w:color="auto" w:sz="4"/>
+          <w:right w:val="single" w:color="auto" w:sz="4"/>
+          <w:insideH w:val="single" w:color="auto" w:sz="4"/>
+          <w:insideV w:val="single" w:color="auto" w:sz="4"/>
+        </w:tblBorders>
+      </w:tblPr>
+      <w:tblGrid>
+        <w:gridCol w:w="1500"/>
+        <w:gridCol w:w="2400"/>
+        <w:gridCol w:w="2400"/>
+        <w:gridCol w:w="3060"/>
+      </w:tblGrid>
+      <w:tr>
+        <w:trPr>
+          <w:tblHeader/>
+        </w:trPr>
+        <w:tc>
+          <w:tcPr>
+            <w:tcW w:type="dxa" w:w="1500"/>
+            <w:tcBorders>
+              <w:top w:val="single" w:color="BBBBBB" w:sz="1"/>
+              <w:left w:val="single" w:color="BBBBBB" w:sz="1"/>
+              <w:bottom w:val="single" w:color="BBBBBB" w:sz="1"/>
+              <w:right w:val="single" w:color="BBBBBB" w:sz="1"/>
+            </w:tcBorders>
+            <w:shd w:fill="D9E2EC" w:val="clear"/>
+            <w:tcMar>
+              <w:top w:type="dxa" w:w="60"/>
+              <w:left w:type="dxa" w:w="110"/>
+              <w:bottom w:type="dxa" w:w="60"/>
+              <w:right w:type="dxa" w:w="110"/>
+            </w:tcMar>
+          </w:tcPr>
+          <w:p>
+            <w:pPr>
+              <w:jc w:val="left"/>
+            </w:pPr>
+            <w:r>
+              <w:rPr>
+                <w:b/>
+                <w:bCs/>
+                <w:sz w:val="19"/>
+                <w:szCs w:val="19"/>
+              </w:rPr>
+              <w:t xml:space="preserve">Agents</w:t>
+            </w:r>
+          </w:p>
+        </w:tc>
+        <w:tc>
+          <w:tcPr>
+            <w:tcW w:type="dxa" w:w="2400"/>
+            <w:tcBorders>
+              <w:top w:val="single" w:color="BBBBBB" w:sz="1"/>
+              <w:left w:val="single" w:color="BBBBBB" w:sz="1"/>
+              <w:bottom w:val="single" w:color="BBBBBB" w:sz="1"/>
+              <w:right w:val="single" w:color="BBBBBB" w:sz="1"/>
+            </w:tcBorders>
+            <w:shd w:fill="D9E2EC" w:val="clear"/>
+            <w:tcMar>
+              <w:top w:type="dxa" w:w="60"/>
+              <w:left w:type="dxa" w:w="110"/>
+              <w:bottom w:type="dxa" w:w="60"/>
+              <w:right w:type="dxa" w:w="110"/>
+            </w:tcMar>
+          </w:tcPr>
+          <w:p>
+            <w:pPr>
+              <w:jc w:val="right"/>
+            </w:pPr>
+            <w:r>
+              <w:rPr>
+                <w:b/>
+                <w:bCs/>
+                <w:sz w:val="19"/>
+                <w:szCs w:val="19"/>
+              </w:rPr>
+              <w:t xml:space="preserve">A2A no SLIM mean</w:t>
+            </w:r>
+          </w:p>
+        </w:tc>
+        <w:tc>
+          <w:tcPr>
+            <w:tcW w:type="dxa" w:w="2400"/>
+            <w:tcBorders>
+              <w:top w:val="single" w:color="BBBBBB" w:sz="1"/>
+              <w:left w:val="single" w:color="BBBBBB" w:sz="1"/>
+              <w:bottom w:val="single" w:color="BBBBBB" w:sz="1"/>
+              <w:right w:val="single" w:color="BBBBBB" w:sz="1"/>
+            </w:tcBorders>
+            <w:shd w:fill="D9E2EC" w:val="clear"/>
+            <w:tcMar>
+              <w:top w:type="dxa" w:w="60"/>
+              <w:left w:type="dxa" w:w="110"/>
+              <w:bottom w:type="dxa" w:w="60"/>
+              <w:right w:type="dxa" w:w="110"/>
+            </w:tcMar>
+          </w:tcPr>
+          <w:p>
+            <w:pPr>
+              <w:jc w:val="right"/>
+            </w:pPr>
+            <w:r>
+              <w:rPr>
+                <w:b/>
+                <w:bCs/>
+                <w:sz w:val="19"/>
+                <w:szCs w:val="19"/>
+              </w:rPr>
+              <w:t xml:space="preserve">A2A over SLIM mean</w:t>
+            </w:r>
+          </w:p>
+        </w:tc>
+        <w:tc>
+          <w:tcPr>
+            <w:tcW w:type="dxa" w:w="3060"/>
+            <w:tcBorders>
+              <w:top w:val="single" w:color="BBBBBB" w:sz="1"/>
+              <w:left w:val="single" w:color="BBBBBB" w:sz="1"/>
+              <w:bottom w:val="single" w:color="BBBBBB" w:sz="1"/>
+              <w:right w:val="single" w:color="BBBBBB" w:sz="1"/>
+            </w:tcBorders>
+            <w:shd w:fill="D9E2EC" w:val="clear"/>
+            <w:tcMar>
+              <w:top w:type="dxa" w:w="60"/>
+              <w:left w:type="dxa" w:w="110"/>
+              <w:bottom w:type="dxa" w:w="60"/>
+              <w:right w:type="dxa" w:w="110"/>
+            </w:tcMar>
+          </w:tcPr>
+          <w:p>
+            <w:pPr>
+              <w:jc w:val="right"/>
+            </w:pPr>
+            <w:r>
+              <w:rPr>
+                <w:b/>
+                <w:bCs/>
+                <w:sz w:val="19"/>
+                <w:szCs w:val="19"/>
+              </w:rPr>
+              <w:t xml:space="preserve">Difference</w:t>
+            </w:r>
+          </w:p>
+        </w:tc>
+      </w:tr>
+      <w:tr>
+        <w:trPr>
+          <w:tblHeader w:val="false"/>
+        </w:trPr>
+        <w:tc>
+          <w:tcPr>
+            <w:tcW w:type="dxa" w:w="1500"/>
+            <w:tcBorders>
+              <w:top w:val="single" w:color="BBBBBB" w:sz="1"/>
+              <w:left w:val="single" w:color="BBBBBB" w:sz="1"/>
+              <w:bottom w:val="single" w:color="BBBBBB" w:sz="1"/>
+              <w:right w:val="single" w:color="BBBBBB" w:sz="1"/>
+            </w:tcBorders>
+            <w:shd w:fill="FFFFFF" w:val="clear"/>
+            <w:tcMar>
+              <w:top w:type="dxa" w:w="60"/>
+              <w:left w:type="dxa" w:w="110"/>
+              <w:bottom w:type="dxa" w:w="60"/>
+              <w:right w:type="dxa" w:w="110"/>
+            </w:tcMar>
+          </w:tcPr>
+          <w:p>
+            <w:pPr>
+              <w:jc w:val="left"/>
+            </w:pPr>
+            <w:r>
+              <w:rPr>
+                <w:b w:val="false"/>
+                <w:bCs w:val="false"/>
+                <w:sz w:val="19"/>
+                <w:szCs w:val="19"/>
+              </w:rPr>
+              <w:t xml:space="preserve">5</w:t>
+            </w:r>
+          </w:p>
+        </w:tc>
+        <w:tc>
+          <w:tcPr>
+            <w:tcW w:type="dxa" w:w="2400"/>
+            <w:tcBorders>
+              <w:top w:val="single" w:color="BBBBBB" w:sz="1"/>
+              <w:left w:val="single" w:color="BBBBBB" w:sz="1"/>
+              <w:bottom w:val="single" w:color="BBBBBB" w:sz="1"/>
+              <w:right w:val="single" w:color="BBBBBB" w:sz="1"/>
+            </w:tcBorders>
+            <w:shd w:fill="FFFFFF" w:val="clear"/>
+            <w:tcMar>
+              <w:top w:type="dxa" w:w="60"/>
+              <w:left w:type="dxa" w:w="110"/>
+              <w:bottom w:type="dxa" w:w="60"/>
+              <w:right w:type="dxa" w:w="110"/>
+            </w:tcMar>
+          </w:tcPr>
+          <w:p>
+            <w:pPr>
+              <w:jc w:val="right"/>
+            </w:pPr>
+            <w:r>
+              <w:rPr>
+                <w:b w:val="false"/>
+                <w:bCs w:val="false"/>
+                <w:sz w:val="19"/>
+                <w:szCs w:val="19"/>
+              </w:rPr>
+              <w:t xml:space="preserve">3.07</w:t>
+            </w:r>
+          </w:p>
+        </w:tc>
+        <w:tc>
+          <w:tcPr>
+            <w:tcW w:type="dxa" w:w="2400"/>
+            <w:tcBorders>
+              <w:top w:val="single" w:color="BBBBBB" w:sz="1"/>
+              <w:left w:val="single" w:color="BBBBBB" w:sz="1"/>
+              <w:bottom w:val="single" w:color="BBBBBB" w:sz="1"/>
+              <w:right w:val="single" w:color="BBBBBB" w:sz="1"/>
+            </w:tcBorders>
+            <w:shd w:fill="FFFFFF" w:val="clear"/>
+            <w:tcMar>
+              <w:top w:type="dxa" w:w="60"/>
+              <w:left w:type="dxa" w:w="110"/>
+              <w:bottom w:type="dxa" w:w="60"/>
+              <w:right w:type="dxa" w:w="110"/>
+            </w:tcMar>
+          </w:tcPr>
+          <w:p>
+            <w:pPr>
+              <w:jc w:val="right"/>
+            </w:pPr>
+            <w:r>
+              <w:rPr>
+                <w:b w:val="false"/>
+                <w:bCs w:val="false"/>
+                <w:sz w:val="19"/>
+                <w:szCs w:val="19"/>
+              </w:rPr>
+              <w:t xml:space="preserve">9.69</w:t>
+            </w:r>
+          </w:p>
+        </w:tc>
+        <w:tc>
+          <w:tcPr>
+            <w:tcW w:type="dxa" w:w="3060"/>
+            <w:tcBorders>
+              <w:top w:val="single" w:color="BBBBBB" w:sz="1"/>
+              <w:left w:val="single" w:color="BBBBBB" w:sz="1"/>
+              <w:bottom w:val="single" w:color="BBBBBB" w:sz="1"/>
+              <w:right w:val="single" w:color="BBBBBB" w:sz="1"/>
+            </w:tcBorders>
+            <w:shd w:fill="FFFFFF" w:val="clear"/>
+            <w:tcMar>
+              <w:top w:type="dxa" w:w="60"/>
+              <w:left w:type="dxa" w:w="110"/>
+              <w:bottom w:type="dxa" w:w="60"/>
+              <w:right w:type="dxa" w:w="110"/>
+            </w:tcMar>
+          </w:tcPr>
+          <w:p>
+            <w:pPr>
+              <w:jc w:val="right"/>
+            </w:pPr>
+            <w:r>
+              <w:rPr>
+                <w:b w:val="false"/>
+                <w:bCs w:val="false"/>
+                <w:sz w:val="19"/>
+                <w:szCs w:val="19"/>
+              </w:rPr>
+              <w:t xml:space="preserve">SLIM +6.6</w:t>
+            </w:r>
+          </w:p>
+        </w:tc>
+      </w:tr>
+      <w:tr>
+        <w:trPr>
+          <w:tblHeader w:val="false"/>
+        </w:trPr>
+        <w:tc>
+          <w:tcPr>
+            <w:tcW w:type="dxa" w:w="1500"/>
+            <w:tcBorders>
+              <w:top w:val="single" w:color="BBBBBB" w:sz="1"/>
+              <w:left w:val="single" w:color="BBBBBB" w:sz="1"/>
+              <w:bottom w:val="single" w:color="BBBBBB" w:sz="1"/>
+              <w:right w:val="single" w:color="BBBBBB" w:sz="1"/>
+            </w:tcBorders>
+            <w:shd w:fill="F2F5F8" w:val="clear"/>
+            <w:tcMar>
+              <w:top w:type="dxa" w:w="60"/>
+              <w:left w:type="dxa" w:w="110"/>
+              <w:bottom w:type="dxa" w:w="60"/>
+              <w:right w:type="dxa" w:w="110"/>
+            </w:tcMar>
+          </w:tcPr>
+          <w:p>
+            <w:pPr>
+              <w:jc w:val="left"/>
+            </w:pPr>
+            <w:r>
+              <w:rPr>
+                <w:b w:val="false"/>
+                <w:bCs w:val="false"/>
+                <w:sz w:val="19"/>
+                <w:szCs w:val="19"/>
+              </w:rPr>
+              <w:t xml:space="preserve">10</w:t>
+            </w:r>
+          </w:p>
+        </w:tc>
+        <w:tc>
+          <w:tcPr>
+            <w:tcW w:type="dxa" w:w="2400"/>
+            <w:tcBorders>
+              <w:top w:val="single" w:color="BBBBBB" w:sz="1"/>
+              <w:left w:val="single" w:color="BBBBBB" w:sz="1"/>
+              <w:bottom w:val="single" w:color="BBBBBB" w:sz="1"/>
+              <w:right w:val="single" w:color="BBBBBB" w:sz="1"/>
+            </w:tcBorders>
+            <w:shd w:fill="F2F5F8" w:val="clear"/>
+            <w:tcMar>
+              <w:top w:type="dxa" w:w="60"/>
+              <w:left w:type="dxa" w:w="110"/>
+              <w:bottom w:type="dxa" w:w="60"/>
+              <w:right w:type="dxa" w:w="110"/>
+            </w:tcMar>
+          </w:tcPr>
+          <w:p>
+            <w:pPr>
+              <w:jc w:val="right"/>
+            </w:pPr>
+            <w:r>
+              <w:rPr>
+                <w:b w:val="false"/>
+                <w:bCs w:val="false"/>
+                <w:sz w:val="19"/>
+                <w:szCs w:val="19"/>
+              </w:rPr>
+              <w:t xml:space="preserve">4.07</w:t>
+            </w:r>
+          </w:p>
+        </w:tc>
+        <w:tc>
+          <w:tcPr>
+            <w:tcW w:type="dxa" w:w="2400"/>
+            <w:tcBorders>
+              <w:top w:val="single" w:color="BBBBBB" w:sz="1"/>
+              <w:left w:val="single" w:color="BBBBBB" w:sz="1"/>
+              <w:bottom w:val="single" w:color="BBBBBB" w:sz="1"/>
+              <w:right w:val="single" w:color="BBBBBB" w:sz="1"/>
+            </w:tcBorders>
+            <w:shd w:fill="F2F5F8" w:val="clear"/>
+            <w:tcMar>
+              <w:top w:type="dxa" w:w="60"/>
+              <w:left w:type="dxa" w:w="110"/>
+              <w:bottom w:type="dxa" w:w="60"/>
+              <w:right w:type="dxa" w:w="110"/>
+            </w:tcMar>
+          </w:tcPr>
+          <w:p>
+            <w:pPr>
+              <w:jc w:val="right"/>
+            </w:pPr>
+            <w:r>
+              <w:rPr>
+                <w:b w:val="false"/>
+                <w:bCs w:val="false"/>
+                <w:sz w:val="19"/>
+                <w:szCs w:val="19"/>
+              </w:rPr>
+              <w:t xml:space="preserve">11.94</w:t>
+            </w:r>
+          </w:p>
+        </w:tc>
+        <w:tc>
+          <w:tcPr>
+            <w:tcW w:type="dxa" w:w="3060"/>
+            <w:tcBorders>
+              <w:top w:val="single" w:color="BBBBBB" w:sz="1"/>
+              <w:left w:val="single" w:color="BBBBBB" w:sz="1"/>
+              <w:bottom w:val="single" w:color="BBBBBB" w:sz="1"/>
+              <w:right w:val="single" w:color="BBBBBB" w:sz="1"/>
+            </w:tcBorders>
+            <w:shd w:fill="F2F5F8" w:val="clear"/>
+            <w:tcMar>
+              <w:top w:type="dxa" w:w="60"/>
+              <w:left w:type="dxa" w:w="110"/>
+              <w:bottom w:type="dxa" w:w="60"/>
+              <w:right w:type="dxa" w:w="110"/>
+            </w:tcMar>
+          </w:tcPr>
+          <w:p>
+            <w:pPr>
+              <w:jc w:val="right"/>
+            </w:pPr>
+            <w:r>
+              <w:rPr>
+                <w:b w:val="false"/>
+                <w:bCs w:val="false"/>
+                <w:sz w:val="19"/>
+                <w:szCs w:val="19"/>
+              </w:rPr>
+              <w:t xml:space="preserve">SLIM +7.9</w:t>
+            </w:r>
+          </w:p>
+        </w:tc>
+      </w:tr>
+      <w:tr>
+        <w:trPr>
+          <w:tblHeader w:val="false"/>
+        </w:trPr>
+        <w:tc>
+          <w:tcPr>
+            <w:tcW w:type="dxa" w:w="1500"/>
+            <w:tcBorders>
+              <w:top w:val="single" w:color="BBBBBB" w:sz="1"/>
+              <w:left w:val="single" w:color="BBBBBB" w:sz="1"/>
+              <w:bottom w:val="single" w:color="BBBBBB" w:sz="1"/>
+              <w:right w:val="single" w:color="BBBBBB" w:sz="1"/>
+            </w:tcBorders>
+            <w:shd w:fill="FFFFFF" w:val="clear"/>
+            <w:tcMar>
+              <w:top w:type="dxa" w:w="60"/>
+              <w:left w:type="dxa" w:w="110"/>
+              <w:bottom w:type="dxa" w:w="60"/>
+              <w:right w:type="dxa" w:w="110"/>
+            </w:tcMar>
+          </w:tcPr>
+          <w:p>
+            <w:pPr>
+              <w:jc w:val="left"/>
+            </w:pPr>
+            <w:r>
+              <w:rPr>
+                <w:b w:val="false"/>
+                <w:bCs w:val="false"/>
+                <w:sz w:val="19"/>
+                <w:szCs w:val="19"/>
+              </w:rPr>
+              <w:t xml:space="preserve">20</w:t>
+            </w:r>
+          </w:p>
+        </w:tc>
+        <w:tc>
+          <w:tcPr>
+            <w:tcW w:type="dxa" w:w="2400"/>
+            <w:tcBorders>
+              <w:top w:val="single" w:color="BBBBBB" w:sz="1"/>
+              <w:left w:val="single" w:color="BBBBBB" w:sz="1"/>
+              <w:bottom w:val="single" w:color="BBBBBB" w:sz="1"/>
+              <w:right w:val="single" w:color="BBBBBB" w:sz="1"/>
+            </w:tcBorders>
+            <w:shd w:fill="FFFFFF" w:val="clear"/>
+            <w:tcMar>
+              <w:top w:type="dxa" w:w="60"/>
+              <w:left w:type="dxa" w:w="110"/>
+              <w:bottom w:type="dxa" w:w="60"/>
+              <w:right w:type="dxa" w:w="110"/>
+            </w:tcMar>
+          </w:tcPr>
+          <w:p>
+            <w:pPr>
+              <w:jc w:val="right"/>
+            </w:pPr>
+            <w:r>
+              <w:rPr>
+                <w:b w:val="false"/>
+                <w:bCs w:val="false"/>
+                <w:sz w:val="19"/>
+                <w:szCs w:val="19"/>
+              </w:rPr>
+              <w:t xml:space="preserve">7.45</w:t>
+            </w:r>
+          </w:p>
+        </w:tc>
+        <w:tc>
+          <w:tcPr>
+            <w:tcW w:type="dxa" w:w="2400"/>
+            <w:tcBorders>
+              <w:top w:val="single" w:color="BBBBBB" w:sz="1"/>
+              <w:left w:val="single" w:color="BBBBBB" w:sz="1"/>
+              <w:bottom w:val="single" w:color="BBBBBB" w:sz="1"/>
+              <w:right w:val="single" w:color="BBBBBB" w:sz="1"/>
+            </w:tcBorders>
+            <w:shd w:fill="FFFFFF" w:val="clear"/>
+            <w:tcMar>
+              <w:top w:type="dxa" w:w="60"/>
+              <w:left w:type="dxa" w:w="110"/>
+              <w:bottom w:type="dxa" w:w="60"/>
+              <w:right w:type="dxa" w:w="110"/>
+            </w:tcMar>
+          </w:tcPr>
+          <w:p>
+            <w:pPr>
+              <w:jc w:val="right"/>
+            </w:pPr>
+            <w:r>
+              <w:rPr>
+                <w:b w:val="false"/>
+                <w:bCs w:val="false"/>
+                <w:sz w:val="19"/>
+                <w:szCs w:val="19"/>
+              </w:rPr>
+              <w:t xml:space="preserve">18.55</w:t>
+            </w:r>
+          </w:p>
+        </w:tc>
+        <w:tc>
+          <w:tcPr>
+            <w:tcW w:type="dxa" w:w="3060"/>
+            <w:tcBorders>
+              <w:top w:val="single" w:color="BBBBBB" w:sz="1"/>
+              <w:left w:val="single" w:color="BBBBBB" w:sz="1"/>
+              <w:bottom w:val="single" w:color="BBBBBB" w:sz="1"/>
+              <w:right w:val="single" w:color="BBBBBB" w:sz="1"/>
+            </w:tcBorders>
+            <w:shd w:fill="FFFFFF" w:val="clear"/>
+            <w:tcMar>
+              <w:top w:type="dxa" w:w="60"/>
+              <w:left w:type="dxa" w:w="110"/>
+              <w:bottom w:type="dxa" w:w="60"/>
+              <w:right w:type="dxa" w:w="110"/>
+            </w:tcMar>
+          </w:tcPr>
+          <w:p>
+            <w:pPr>
+              <w:jc w:val="right"/>
+            </w:pPr>
+            <w:r>
+              <w:rPr>
+                <w:b w:val="false"/>
+                <w:bCs w:val="false"/>
+                <w:sz w:val="19"/>
+                <w:szCs w:val="19"/>
+              </w:rPr>
+              <w:t xml:space="preserve">SLIM +11.1</w:t>
+            </w:r>
+          </w:p>
+        </w:tc>
+      </w:tr>
+    </w:tbl>
+    <w:p>
+      <w:pPr>
         <w:pStyle w:val="Heading1"/>
       </w:pPr>
       <w:r>
@@ -3589,6 +4160,23 @@
     </w:p>
     <w:p>
       <w:pPr>
+        <w:pStyle w:val="ListParagraph"/>
+        <w:numPr>
+          <w:ilvl w:val="0"/>
+          <w:numId w:val="2"/>
+        </w:numPr>
+        <w:spacing w:after="60"/>
+      </w:pPr>
+      <w:r>
+        <w:rPr>
+          <w:sz w:val="22"/>
+          <w:szCs w:val="22"/>
+        </w:rPr>
+        <w:t xml:space="preserve">For A2A on this single machine the order reverses: A2A over SLIM is slower than A2A without SLIM, because the SLIM RPC and per-call session handshake add fixed overhead that the cheap loopback HTTP path does not pay. The SLIM benefit for A2A is expected to appear at larger scale or over a real network, not on loopback; confirming that is follow-up work.</w:t>
+      </w:r>
+    </w:p>
+    <w:p>
+      <w:pPr>
         <w:pStyle w:val="Heading1"/>
       </w:pPr>
       <w:r>
@@ -3857,6 +4445,124 @@
           <w:sz w:val="22"/>
           <w:szCs w:val="22"/>
         </w:rPr>
+        <w:t xml:space="preserve">A2A cells use a separate Python 3.13 env (.venv-a2a) and a slim:1.0.0 node with the Aether config. Cell 2 (A2A over SLIM):</w:t>
+      </w:r>
+    </w:p>
+    <w:p>
+      <w:pPr>
+        <w:shd w:fill="F0F0F0" w:val="clear"/>
+        <w:spacing w:after="40"/>
+      </w:pPr>
+      <w:r>
+        <w:rPr>
+          <w:rFonts w:ascii="Consolas" w:cs="Consolas" w:eastAsia="Consolas" w:hAnsi="Consolas"/>
+          <w:sz w:val="18"/>
+          <w:szCs w:val="18"/>
+        </w:rPr>
+        <w:t xml:space="preserve">.venv-a2a/bin/python a2a_slim_mesh_benchmark.py --sweep \</w:t>
+      </w:r>
+    </w:p>
+    <w:p>
+      <w:pPr>
+        <w:shd w:fill="F0F0F0" w:val="clear"/>
+        <w:spacing w:after="40"/>
+      </w:pPr>
+      <w:r>
+        <w:rPr>
+          <w:rFonts w:ascii="Consolas" w:cs="Consolas" w:eastAsia="Consolas" w:hAnsi="Consolas"/>
+          <w:sz w:val="18"/>
+          <w:szCs w:val="18"/>
+        </w:rPr>
+        <w:t xml:space="preserve">  --agents-list 5,10,20 --payloads 64 --rounds 3 \</w:t>
+      </w:r>
+    </w:p>
+    <w:p>
+      <w:pPr>
+        <w:shd w:fill="F0F0F0" w:val="clear"/>
+        <w:spacing w:after="40"/>
+      </w:pPr>
+      <w:r>
+        <w:rPr>
+          <w:rFonts w:ascii="Consolas" w:cs="Consolas" w:eastAsia="Consolas" w:hAnsi="Consolas"/>
+          <w:sz w:val="18"/>
+          <w:szCs w:val="18"/>
+        </w:rPr>
+        <w:t xml:space="preserve">  --output docs/evidence/a2a_slim_mesh_sweep.json</w:t>
+      </w:r>
+    </w:p>
+    <w:p>
+      <w:pPr>
+        <w:pStyle w:val="ListParagraph"/>
+        <w:numPr>
+          <w:ilvl w:val="0"/>
+          <w:numId w:val="3"/>
+        </w:numPr>
+        <w:spacing w:after="60"/>
+      </w:pPr>
+      <w:r>
+        <w:rPr>
+          <w:sz w:val="22"/>
+          <w:szCs w:val="22"/>
+        </w:rPr>
+        <w:t xml:space="preserve">Cell 1 (A2A no SLIM; needs no node).</w:t>
+      </w:r>
+    </w:p>
+    <w:p>
+      <w:pPr>
+        <w:shd w:fill="F0F0F0" w:val="clear"/>
+        <w:spacing w:after="40"/>
+      </w:pPr>
+      <w:r>
+        <w:rPr>
+          <w:rFonts w:ascii="Consolas" w:cs="Consolas" w:eastAsia="Consolas" w:hAnsi="Consolas"/>
+          <w:sz w:val="18"/>
+          <w:szCs w:val="18"/>
+        </w:rPr>
+        <w:t xml:space="preserve">.venv-a2a/bin/python a2a_http_mesh_benchmark.py --sweep \</w:t>
+      </w:r>
+    </w:p>
+    <w:p>
+      <w:pPr>
+        <w:shd w:fill="F0F0F0" w:val="clear"/>
+        <w:spacing w:after="40"/>
+      </w:pPr>
+      <w:r>
+        <w:rPr>
+          <w:rFonts w:ascii="Consolas" w:cs="Consolas" w:eastAsia="Consolas" w:hAnsi="Consolas"/>
+          <w:sz w:val="18"/>
+          <w:szCs w:val="18"/>
+        </w:rPr>
+        <w:t xml:space="preserve">  --agents-list 5,10,20 --payloads 64 --rounds 3 \</w:t>
+      </w:r>
+    </w:p>
+    <w:p>
+      <w:pPr>
+        <w:shd w:fill="F0F0F0" w:val="clear"/>
+        <w:spacing w:after="40"/>
+      </w:pPr>
+      <w:r>
+        <w:rPr>
+          <w:rFonts w:ascii="Consolas" w:cs="Consolas" w:eastAsia="Consolas" w:hAnsi="Consolas"/>
+          <w:sz w:val="18"/>
+          <w:szCs w:val="18"/>
+        </w:rPr>
+        <w:t xml:space="preserve">  --output docs/evidence/a2a_http_mesh_sweep.json</w:t>
+      </w:r>
+    </w:p>
+    <w:p>
+      <w:pPr>
+        <w:pStyle w:val="ListParagraph"/>
+        <w:numPr>
+          <w:ilvl w:val="0"/>
+          <w:numId w:val="3"/>
+        </w:numPr>
+        <w:spacing w:after="60"/>
+      </w:pPr>
+      <w:r>
+        <w:rPr>
+          <w:sz w:val="22"/>
+          <w:szCs w:val="22"/>
+        </w:rPr>
         <w:t xml:space="preserve">Stop the node when finished.</w:t>
       </w:r>
     </w:p>
@@ -3981,7 +4687,7 @@
           <w:sz w:val="22"/>
           <w:szCs w:val="22"/>
         </w:rPr>
-        <w:t xml:space="preserve">slim_bench/results.py: shared result and summary-statistics shape used by every leg.</w:t>
+        <w:t xml:space="preserve">slim_bench/a2a_http_mesh.py and a2a_http_mesh_benchmark.py: A2A no-SLIM harness and runner (cell 1).</w:t>
       </w:r>
     </w:p>
     <w:p>
@@ -3998,15 +4704,7 @@
           <w:sz w:val="22"/>
           <w:szCs w:val="22"/>
         </w:rPr>
-        <w:t xml:space="preserve">docs/evidence: mesh_sweep_parallel.json, http_mesh_sweep_parallel.json, and http_slim_mesh_sweep.json hold the raw results behind this report.</w:t>
-      </w:r>
-    </w:p>
-    <w:p>
-      <w:pPr>
-        <w:pStyle w:val="Heading1"/>
-      </w:pPr>
-      <w:r>
-        <w:t xml:space="preserve">10. Limitations and open items</w:t>
+        <w:t xml:space="preserve">slim_bench/a2a_slim_mesh.py and a2a_slim_mesh_benchmark.py: A2A-over-SLIM harness and runner (cell 2).</w:t>
       </w:r>
     </w:p>
     <w:p>
@@ -4023,7 +4721,7 @@
           <w:sz w:val="22"/>
           <w:szCs w:val="22"/>
         </w:rPr>
-        <w:t xml:space="preserve">All measurements are loopback on one machine, so they are a lower bound; numbers will move over a real network.</w:t>
+        <w:t xml:space="preserve">slim_bench/results.py: shared result and summary-statistics shape used by every leg.</w:t>
       </w:r>
     </w:p>
     <w:p>
@@ -4040,7 +4738,15 @@
           <w:sz w:val="22"/>
           <w:szCs w:val="22"/>
         </w:rPr>
-        <w:t xml:space="preserve">True simultaneity is capped at the core count (12 here); larger agent counts are partly time-sliced.</w:t>
+        <w:t xml:space="preserve">docs/evidence holds the raw sweep results for all four cells.</w:t>
+      </w:r>
+    </w:p>
+    <w:p>
+      <w:pPr>
+        <w:pStyle w:val="Heading1"/>
+      </w:pPr>
+      <w:r>
+        <w:t xml:space="preserve">10. Limitations and open items</w:t>
       </w:r>
     </w:p>
     <w:p>
@@ -4057,7 +4763,7 @@
           <w:sz w:val="22"/>
           <w:szCs w:val="22"/>
         </w:rPr>
-        <w:t xml:space="preserve">Message model is not yet pinned: SLIM measures a one-way publish to confirmed delivery, while HTTP measures a full request-response round trip. These are not yet symmetric and must be aligned before the headline comparison.</w:t>
+        <w:t xml:space="preserve">All measurements are loopback on one machine, so they are a lower bound; numbers will move over a real network.</w:t>
       </w:r>
     </w:p>
     <w:p>
@@ -4074,7 +4780,7 @@
           <w:sz w:val="22"/>
           <w:szCs w:val="22"/>
         </w:rPr>
-        <w:t xml:space="preserve">Cells 1 and 2 (A2A and the A2A-over-SLIM tunnel) remain to be built; the sweep should then be extended toward 100 agents.</w:t>
+        <w:t xml:space="preserve">True simultaneity is capped at the core count (12 here); larger agent counts are partly time-sliced.</w:t>
       </w:r>
     </w:p>
     <w:p>
@@ -4091,7 +4797,41 @@
           <w:sz w:val="22"/>
           <w:szCs w:val="22"/>
         </w:rPr>
-        <w:t xml:space="preserve">Cell 4 currently has sequential and concurrent modes; the process-per-agent parallel mode can be added for full symmetry with the other legs.</w:t>
+        <w:t xml:space="preserve">Message model is not yet pinned: SLIM measures a one-way publish to confirmed delivery, while HTTP measures a full request-response round trip. These are not yet symmetric and must be aligned before the headline comparison.</w:t>
+      </w:r>
+    </w:p>
+    <w:p>
+      <w:pPr>
+        <w:pStyle w:val="ListParagraph"/>
+        <w:numPr>
+          <w:ilvl w:val="0"/>
+          <w:numId w:val="2"/>
+        </w:numPr>
+        <w:spacing w:after="60"/>
+      </w:pPr>
+      <w:r>
+        <w:rPr>
+          <w:sz w:val="22"/>
+          <w:szCs w:val="22"/>
+        </w:rPr>
+        <w:t xml:space="preserve">All four cells are implemented. The sweep should be extended toward 100 agents, and repeated over a real network to confirm the SLIM benefit for A2A that loopback hides.</w:t>
+      </w:r>
+    </w:p>
+    <w:p>
+      <w:pPr>
+        <w:pStyle w:val="ListParagraph"/>
+        <w:numPr>
+          <w:ilvl w:val="0"/>
+          <w:numId w:val="2"/>
+        </w:numPr>
+        <w:spacing w:after="60"/>
+      </w:pPr>
+      <w:r>
+        <w:rPr>
+          <w:sz w:val="22"/>
+          <w:szCs w:val="22"/>
+        </w:rPr>
+        <w:t xml:space="preserve">A2A cells use an echo agent, so they measure transport only; adding the real semantic-negotiation handler would measure end-to-end convergence.</w:t>
       </w:r>
     </w:p>
     <w:sectPr>

</xml_diff>